<commit_message>
Code blocks syntax highlighting
</commit_message>
<xml_diff>
--- a/DocumentDefinitions/reference-ictu.docx
+++ b/DocumentDefinitions/reference-ictu.docx
@@ -1,6 +1,6 @@
 
 <file path=word/document.xml><?xml version="1.0" encoding="utf-8"?>
-<w:document xmlns:wpc="http://schemas.microsoft.com/office/word/2010/wordprocessingCanvas" xmlns:cx="http://schemas.microsoft.com/office/drawing/2014/chartex" xmlns:cx1="http://schemas.microsoft.com/office/drawing/2015/9/8/chartex" xmlns:cx2="http://schemas.microsoft.com/office/drawing/2015/10/21/chartex" xmlns:cx3="http://schemas.microsoft.com/office/drawing/2016/5/9/chartex" xmlns:cx4="http://schemas.microsoft.com/office/drawing/2016/5/10/chartex" xmlns:cx5="http://schemas.microsoft.com/office/drawing/2016/5/11/chartex" xmlns:cx6="http://schemas.microsoft.com/office/drawing/2016/5/12/chartex" xmlns:cx7="http://schemas.microsoft.com/office/drawing/2016/5/13/chartex" xmlns:cx8="http://schemas.microsoft.com/office/drawing/2016/5/14/chartex" xmlns:mc="http://schemas.openxmlformats.org/markup-compatibility/2006" xmlns:aink="http://schemas.microsoft.com/office/drawing/2016/ink" xmlns:am3d="http://schemas.microsoft.com/office/drawing/2017/model3d" xmlns:o="urn:schemas-microsoft-com:office:office" xmlns:oel="http://schemas.microsoft.com/office/2019/extlst" xmlns:r="http://schemas.openxmlformats.org/officeDocument/2006/relationships" xmlns:m="http://schemas.openxmlformats.org/officeDocument/2006/math" xmlns:v="urn:schemas-microsoft-com:vml" xmlns:wp14="http://schemas.microsoft.com/office/word/2010/wordprocessingDrawing" xmlns:wp="http://schemas.openxmlformats.org/drawingml/2006/wordprocessingDrawing" xmlns:w10="urn:schemas-microsoft-com:office:word" xmlns:w="http://schemas.openxmlformats.org/wordprocessingml/2006/main" xmlns:w14="http://schemas.microsoft.com/office/word/2010/wordml" xmlns:w15="http://schemas.microsoft.com/office/word/2012/wordml" xmlns:w16cex="http://schemas.microsoft.com/office/word/2018/wordml/cex" xmlns:w16cid="http://schemas.microsoft.com/office/word/2016/wordml/cid" xmlns:w16="http://schemas.microsoft.com/office/word/2018/wordml" xmlns:w16du="http://schemas.microsoft.com/office/word/2023/wordml/word16du" xmlns:w16sdtdh="http://schemas.microsoft.com/office/word/2020/wordml/sdtdatahash" xmlns:w16sdtfl="http://schemas.microsoft.com/office/word/2024/wordml/sdtformatlock" xmlns:w16se="http://schemas.microsoft.com/office/word/2015/wordml/symex" xmlns:wpg="http://schemas.microsoft.com/office/word/2010/wordprocessingGroup" xmlns:wpi="http://schemas.microsoft.com/office/word/2010/wordprocessingInk" xmlns:wne="http://schemas.microsoft.com/office/word/2006/wordml" xmlns:wps="http://schemas.microsoft.com/office/word/2010/wordprocessingShape" mc:Ignorable="w14 w15 w16se w16cid w16 w16cex w16sdtdh w16sdtfl w16du wp14">
+<w:document xmlns:wpc="http://schemas.microsoft.com/office/word/2010/wordprocessingCanvas" xmlns:cx="http://schemas.microsoft.com/office/drawing/2014/chartex" xmlns:cx1="http://schemas.microsoft.com/office/drawing/2015/9/8/chartex" xmlns:cx2="http://schemas.microsoft.com/office/drawing/2015/10/21/chartex" xmlns:cx3="http://schemas.microsoft.com/office/drawing/2016/5/9/chartex" xmlns:cx4="http://schemas.microsoft.com/office/drawing/2016/5/10/chartex" xmlns:cx5="http://schemas.microsoft.com/office/drawing/2016/5/11/chartex" xmlns:cx6="http://schemas.microsoft.com/office/drawing/2016/5/12/chartex" xmlns:cx7="http://schemas.microsoft.com/office/drawing/2016/5/13/chartex" xmlns:cx8="http://schemas.microsoft.com/office/drawing/2016/5/14/chartex" xmlns:mc="http://schemas.openxmlformats.org/markup-compatibility/2006" xmlns:m="http://schemas.openxmlformats.org/officeDocument/2006/math" xmlns:aink="http://schemas.microsoft.com/office/drawing/2016/ink" xmlns:am3d="http://schemas.microsoft.com/office/drawing/2017/model3d" xmlns:oel="http://schemas.microsoft.com/office/2019/extlst" xmlns:r="http://schemas.openxmlformats.org/officeDocument/2006/relationships" xmlns:wp14="http://schemas.microsoft.com/office/word/2010/wordprocessingDrawing" xmlns:wp="http://schemas.openxmlformats.org/drawingml/2006/wordprocessingDrawing" xmlns:wpg="http://schemas.microsoft.com/office/word/2010/wordprocessingGroup" xmlns:wpi="http://schemas.microsoft.com/office/word/2010/wordprocessingInk" xmlns:wps="http://schemas.microsoft.com/office/word/2010/wordprocessingShape" xmlns:o="urn:schemas-microsoft-com:office:office" xmlns:v="urn:schemas-microsoft-com:vml" xmlns:w10="urn:schemas-microsoft-com:office:word" xmlns:w="http://schemas.openxmlformats.org/wordprocessingml/2006/main" xmlns:w14="http://schemas.microsoft.com/office/word/2010/wordml" xmlns:w15="http://schemas.microsoft.com/office/word/2012/wordml" xmlns:w16cex="http://schemas.microsoft.com/office/word/2018/wordml/cex" xmlns:w16cid="http://schemas.microsoft.com/office/word/2016/wordml/cid" xmlns:w16="http://schemas.microsoft.com/office/word/2018/wordml" xmlns:w16sdtdh="http://schemas.microsoft.com/office/word/2020/wordml/sdtdatahash" xmlns:w16sdtfl="http://schemas.microsoft.com/office/word/2024/wordml/sdtformatlock" xmlns:w16se="http://schemas.microsoft.com/office/word/2015/wordml/symex" xmlns:w16du="http://schemas.microsoft.com/office/word/2023/wordml/word16du" xmlns:wne="http://schemas.microsoft.com/office/word/2006/wordml" mc:Ignorable="w14 w15 w16se w16cid w16 w16cex w16sdtdh w16sdtfl w16du wp14">
   <w:body>
     <w:p/>
     <w:sectPr>
@@ -16,7 +16,7 @@
 </file>
 
 <file path=word/endnotes.xml><?xml version="1.0" encoding="utf-8"?>
-<w:endnotes xmlns:wpc="http://schemas.microsoft.com/office/word/2010/wordprocessingCanvas" xmlns:cx="http://schemas.microsoft.com/office/drawing/2014/chartex" xmlns:cx1="http://schemas.microsoft.com/office/drawing/2015/9/8/chartex" xmlns:cx2="http://schemas.microsoft.com/office/drawing/2015/10/21/chartex" xmlns:cx3="http://schemas.microsoft.com/office/drawing/2016/5/9/chartex" xmlns:cx4="http://schemas.microsoft.com/office/drawing/2016/5/10/chartex" xmlns:cx5="http://schemas.microsoft.com/office/drawing/2016/5/11/chartex" xmlns:cx6="http://schemas.microsoft.com/office/drawing/2016/5/12/chartex" xmlns:cx7="http://schemas.microsoft.com/office/drawing/2016/5/13/chartex" xmlns:cx8="http://schemas.microsoft.com/office/drawing/2016/5/14/chartex" xmlns:mc="http://schemas.openxmlformats.org/markup-compatibility/2006" xmlns:aink="http://schemas.microsoft.com/office/drawing/2016/ink" xmlns:am3d="http://schemas.microsoft.com/office/drawing/2017/model3d" xmlns:o="urn:schemas-microsoft-com:office:office" xmlns:oel="http://schemas.microsoft.com/office/2019/extlst" xmlns:r="http://schemas.openxmlformats.org/officeDocument/2006/relationships" xmlns:m="http://schemas.openxmlformats.org/officeDocument/2006/math" xmlns:v="urn:schemas-microsoft-com:vml" xmlns:wp14="http://schemas.microsoft.com/office/word/2010/wordprocessingDrawing" xmlns:wp="http://schemas.openxmlformats.org/drawingml/2006/wordprocessingDrawing" xmlns:w10="urn:schemas-microsoft-com:office:word" xmlns:w="http://schemas.openxmlformats.org/wordprocessingml/2006/main" xmlns:w14="http://schemas.microsoft.com/office/word/2010/wordml" xmlns:w15="http://schemas.microsoft.com/office/word/2012/wordml" xmlns:w16cex="http://schemas.microsoft.com/office/word/2018/wordml/cex" xmlns:w16cid="http://schemas.microsoft.com/office/word/2016/wordml/cid" xmlns:w16="http://schemas.microsoft.com/office/word/2018/wordml" xmlns:w16du="http://schemas.microsoft.com/office/word/2023/wordml/word16du" xmlns:w16sdtdh="http://schemas.microsoft.com/office/word/2020/wordml/sdtdatahash" xmlns:w16sdtfl="http://schemas.microsoft.com/office/word/2024/wordml/sdtformatlock" xmlns:w16se="http://schemas.microsoft.com/office/word/2015/wordml/symex" xmlns:wpg="http://schemas.microsoft.com/office/word/2010/wordprocessingGroup" xmlns:wpi="http://schemas.microsoft.com/office/word/2010/wordprocessingInk" xmlns:wne="http://schemas.microsoft.com/office/word/2006/wordml" xmlns:wps="http://schemas.microsoft.com/office/word/2010/wordprocessingShape" mc:Ignorable="w14 w15 w16se w16cid w16 w16cex w16sdtdh w16sdtfl w16du wp14">
+<w:endnotes xmlns:wpc="http://schemas.microsoft.com/office/word/2010/wordprocessingCanvas" xmlns:cx="http://schemas.microsoft.com/office/drawing/2014/chartex" xmlns:cx1="http://schemas.microsoft.com/office/drawing/2015/9/8/chartex" xmlns:cx2="http://schemas.microsoft.com/office/drawing/2015/10/21/chartex" xmlns:cx3="http://schemas.microsoft.com/office/drawing/2016/5/9/chartex" xmlns:cx4="http://schemas.microsoft.com/office/drawing/2016/5/10/chartex" xmlns:cx5="http://schemas.microsoft.com/office/drawing/2016/5/11/chartex" xmlns:cx6="http://schemas.microsoft.com/office/drawing/2016/5/12/chartex" xmlns:cx7="http://schemas.microsoft.com/office/drawing/2016/5/13/chartex" xmlns:cx8="http://schemas.microsoft.com/office/drawing/2016/5/14/chartex" xmlns:mc="http://schemas.openxmlformats.org/markup-compatibility/2006" xmlns:m="http://schemas.openxmlformats.org/officeDocument/2006/math" xmlns:aink="http://schemas.microsoft.com/office/drawing/2016/ink" xmlns:am3d="http://schemas.microsoft.com/office/drawing/2017/model3d" xmlns:oel="http://schemas.microsoft.com/office/2019/extlst" xmlns:r="http://schemas.openxmlformats.org/officeDocument/2006/relationships" xmlns:wp14="http://schemas.microsoft.com/office/word/2010/wordprocessingDrawing" xmlns:wp="http://schemas.openxmlformats.org/drawingml/2006/wordprocessingDrawing" xmlns:wpg="http://schemas.microsoft.com/office/word/2010/wordprocessingGroup" xmlns:wpi="http://schemas.microsoft.com/office/word/2010/wordprocessingInk" xmlns:wps="http://schemas.microsoft.com/office/word/2010/wordprocessingShape" xmlns:o="urn:schemas-microsoft-com:office:office" xmlns:v="urn:schemas-microsoft-com:vml" xmlns:w10="urn:schemas-microsoft-com:office:word" xmlns:w="http://schemas.openxmlformats.org/wordprocessingml/2006/main" xmlns:w14="http://schemas.microsoft.com/office/word/2010/wordml" xmlns:w15="http://schemas.microsoft.com/office/word/2012/wordml" xmlns:w16cex="http://schemas.microsoft.com/office/word/2018/wordml/cex" xmlns:w16cid="http://schemas.microsoft.com/office/word/2016/wordml/cid" xmlns:w16="http://schemas.microsoft.com/office/word/2018/wordml" xmlns:w16sdtdh="http://schemas.microsoft.com/office/word/2020/wordml/sdtdatahash" xmlns:w16sdtfl="http://schemas.microsoft.com/office/word/2024/wordml/sdtformatlock" xmlns:w16se="http://schemas.microsoft.com/office/word/2015/wordml/symex" xmlns:w16du="http://schemas.microsoft.com/office/word/2023/wordml/word16du" xmlns:wne="http://schemas.microsoft.com/office/word/2006/wordml" mc:Ignorable="w14 w15 w16se w16cid w16 w16cex w16sdtdh w16sdtfl w16du wp14">
   <w:endnote w:type="separator" w:id="-1">
     <w:p>
       <w:pPr>
@@ -41,7 +41,7 @@
 </file>
 
 <file path=word/footer1.xml><?xml version="1.0" encoding="utf-8"?>
-<w:ftr xmlns:wpc="http://schemas.microsoft.com/office/word/2010/wordprocessingCanvas" xmlns:cx="http://schemas.microsoft.com/office/drawing/2014/chartex" xmlns:cx1="http://schemas.microsoft.com/office/drawing/2015/9/8/chartex" xmlns:cx2="http://schemas.microsoft.com/office/drawing/2015/10/21/chartex" xmlns:cx3="http://schemas.microsoft.com/office/drawing/2016/5/9/chartex" xmlns:cx4="http://schemas.microsoft.com/office/drawing/2016/5/10/chartex" xmlns:cx5="http://schemas.microsoft.com/office/drawing/2016/5/11/chartex" xmlns:cx6="http://schemas.microsoft.com/office/drawing/2016/5/12/chartex" xmlns:cx7="http://schemas.microsoft.com/office/drawing/2016/5/13/chartex" xmlns:cx8="http://schemas.microsoft.com/office/drawing/2016/5/14/chartex" xmlns:mc="http://schemas.openxmlformats.org/markup-compatibility/2006" xmlns:aink="http://schemas.microsoft.com/office/drawing/2016/ink" xmlns:am3d="http://schemas.microsoft.com/office/drawing/2017/model3d" xmlns:o="urn:schemas-microsoft-com:office:office" xmlns:oel="http://schemas.microsoft.com/office/2019/extlst" xmlns:r="http://schemas.openxmlformats.org/officeDocument/2006/relationships" xmlns:m="http://schemas.openxmlformats.org/officeDocument/2006/math" xmlns:v="urn:schemas-microsoft-com:vml" xmlns:wp14="http://schemas.microsoft.com/office/word/2010/wordprocessingDrawing" xmlns:wp="http://schemas.openxmlformats.org/drawingml/2006/wordprocessingDrawing" xmlns:w10="urn:schemas-microsoft-com:office:word" xmlns:w="http://schemas.openxmlformats.org/wordprocessingml/2006/main" xmlns:w14="http://schemas.microsoft.com/office/word/2010/wordml" xmlns:w15="http://schemas.microsoft.com/office/word/2012/wordml" xmlns:w16cex="http://schemas.microsoft.com/office/word/2018/wordml/cex" xmlns:w16cid="http://schemas.microsoft.com/office/word/2016/wordml/cid" xmlns:w16="http://schemas.microsoft.com/office/word/2018/wordml" xmlns:w16du="http://schemas.microsoft.com/office/word/2023/wordml/word16du" xmlns:w16sdtdh="http://schemas.microsoft.com/office/word/2020/wordml/sdtdatahash" xmlns:w16sdtfl="http://schemas.microsoft.com/office/word/2024/wordml/sdtformatlock" xmlns:w16se="http://schemas.microsoft.com/office/word/2015/wordml/symex" xmlns:wpg="http://schemas.microsoft.com/office/word/2010/wordprocessingGroup" xmlns:wpi="http://schemas.microsoft.com/office/word/2010/wordprocessingInk" xmlns:wne="http://schemas.microsoft.com/office/word/2006/wordml" xmlns:wps="http://schemas.microsoft.com/office/word/2010/wordprocessingShape" mc:Ignorable="w14 w15 w16se w16cid w16 w16cex w16sdtdh w16sdtfl w16du wp14">
+<w:ftr xmlns:wpc="http://schemas.microsoft.com/office/word/2010/wordprocessingCanvas" xmlns:cx="http://schemas.microsoft.com/office/drawing/2014/chartex" xmlns:cx1="http://schemas.microsoft.com/office/drawing/2015/9/8/chartex" xmlns:cx2="http://schemas.microsoft.com/office/drawing/2015/10/21/chartex" xmlns:cx3="http://schemas.microsoft.com/office/drawing/2016/5/9/chartex" xmlns:cx4="http://schemas.microsoft.com/office/drawing/2016/5/10/chartex" xmlns:cx5="http://schemas.microsoft.com/office/drawing/2016/5/11/chartex" xmlns:cx6="http://schemas.microsoft.com/office/drawing/2016/5/12/chartex" xmlns:cx7="http://schemas.microsoft.com/office/drawing/2016/5/13/chartex" xmlns:cx8="http://schemas.microsoft.com/office/drawing/2016/5/14/chartex" xmlns:mc="http://schemas.openxmlformats.org/markup-compatibility/2006" xmlns:m="http://schemas.openxmlformats.org/officeDocument/2006/math" xmlns:aink="http://schemas.microsoft.com/office/drawing/2016/ink" xmlns:am3d="http://schemas.microsoft.com/office/drawing/2017/model3d" xmlns:oel="http://schemas.microsoft.com/office/2019/extlst" xmlns:r="http://schemas.openxmlformats.org/officeDocument/2006/relationships" xmlns:wp14="http://schemas.microsoft.com/office/word/2010/wordprocessingDrawing" xmlns:wp="http://schemas.openxmlformats.org/drawingml/2006/wordprocessingDrawing" xmlns:wpg="http://schemas.microsoft.com/office/word/2010/wordprocessingGroup" xmlns:wpi="http://schemas.microsoft.com/office/word/2010/wordprocessingInk" xmlns:wps="http://schemas.microsoft.com/office/word/2010/wordprocessingShape" xmlns:o="urn:schemas-microsoft-com:office:office" xmlns:v="urn:schemas-microsoft-com:vml" xmlns:w10="urn:schemas-microsoft-com:office:word" xmlns:w="http://schemas.openxmlformats.org/wordprocessingml/2006/main" xmlns:w14="http://schemas.microsoft.com/office/word/2010/wordml" xmlns:w15="http://schemas.microsoft.com/office/word/2012/wordml" xmlns:w16cex="http://schemas.microsoft.com/office/word/2018/wordml/cex" xmlns:w16cid="http://schemas.microsoft.com/office/word/2016/wordml/cid" xmlns:w16="http://schemas.microsoft.com/office/word/2018/wordml" xmlns:w16sdtdh="http://schemas.microsoft.com/office/word/2020/wordml/sdtdatahash" xmlns:w16sdtfl="http://schemas.microsoft.com/office/word/2024/wordml/sdtformatlock" xmlns:w16se="http://schemas.microsoft.com/office/word/2015/wordml/symex" xmlns:w16du="http://schemas.microsoft.com/office/word/2023/wordml/word16du" xmlns:wne="http://schemas.microsoft.com/office/word/2006/wordml" mc:Ignorable="w14 w15 w16se w16cid w16 w16cex w16sdtdh w16sdtfl w16du wp14">
   <w:sdt>
     <w:sdtPr>
       <w:id w:val="-458108813"/>
@@ -156,7 +156,7 @@
 </file>
 
 <file path=word/footnotes.xml><?xml version="1.0" encoding="utf-8"?>
-<w:footnotes xmlns:wpc="http://schemas.microsoft.com/office/word/2010/wordprocessingCanvas" xmlns:cx="http://schemas.microsoft.com/office/drawing/2014/chartex" xmlns:cx1="http://schemas.microsoft.com/office/drawing/2015/9/8/chartex" xmlns:cx2="http://schemas.microsoft.com/office/drawing/2015/10/21/chartex" xmlns:cx3="http://schemas.microsoft.com/office/drawing/2016/5/9/chartex" xmlns:cx4="http://schemas.microsoft.com/office/drawing/2016/5/10/chartex" xmlns:cx5="http://schemas.microsoft.com/office/drawing/2016/5/11/chartex" xmlns:cx6="http://schemas.microsoft.com/office/drawing/2016/5/12/chartex" xmlns:cx7="http://schemas.microsoft.com/office/drawing/2016/5/13/chartex" xmlns:cx8="http://schemas.microsoft.com/office/drawing/2016/5/14/chartex" xmlns:mc="http://schemas.openxmlformats.org/markup-compatibility/2006" xmlns:aink="http://schemas.microsoft.com/office/drawing/2016/ink" xmlns:am3d="http://schemas.microsoft.com/office/drawing/2017/model3d" xmlns:o="urn:schemas-microsoft-com:office:office" xmlns:oel="http://schemas.microsoft.com/office/2019/extlst" xmlns:r="http://schemas.openxmlformats.org/officeDocument/2006/relationships" xmlns:m="http://schemas.openxmlformats.org/officeDocument/2006/math" xmlns:v="urn:schemas-microsoft-com:vml" xmlns:wp14="http://schemas.microsoft.com/office/word/2010/wordprocessingDrawing" xmlns:wp="http://schemas.openxmlformats.org/drawingml/2006/wordprocessingDrawing" xmlns:w10="urn:schemas-microsoft-com:office:word" xmlns:w="http://schemas.openxmlformats.org/wordprocessingml/2006/main" xmlns:w14="http://schemas.microsoft.com/office/word/2010/wordml" xmlns:w15="http://schemas.microsoft.com/office/word/2012/wordml" xmlns:w16cex="http://schemas.microsoft.com/office/word/2018/wordml/cex" xmlns:w16cid="http://schemas.microsoft.com/office/word/2016/wordml/cid" xmlns:w16="http://schemas.microsoft.com/office/word/2018/wordml" xmlns:w16du="http://schemas.microsoft.com/office/word/2023/wordml/word16du" xmlns:w16sdtdh="http://schemas.microsoft.com/office/word/2020/wordml/sdtdatahash" xmlns:w16sdtfl="http://schemas.microsoft.com/office/word/2024/wordml/sdtformatlock" xmlns:w16se="http://schemas.microsoft.com/office/word/2015/wordml/symex" xmlns:wpg="http://schemas.microsoft.com/office/word/2010/wordprocessingGroup" xmlns:wpi="http://schemas.microsoft.com/office/word/2010/wordprocessingInk" xmlns:wne="http://schemas.microsoft.com/office/word/2006/wordml" xmlns:wps="http://schemas.microsoft.com/office/word/2010/wordprocessingShape" mc:Ignorable="w14 w15 w16se w16cid w16 w16cex w16sdtdh w16sdtfl w16du wp14">
+<w:footnotes xmlns:wpc="http://schemas.microsoft.com/office/word/2010/wordprocessingCanvas" xmlns:cx="http://schemas.microsoft.com/office/drawing/2014/chartex" xmlns:cx1="http://schemas.microsoft.com/office/drawing/2015/9/8/chartex" xmlns:cx2="http://schemas.microsoft.com/office/drawing/2015/10/21/chartex" xmlns:cx3="http://schemas.microsoft.com/office/drawing/2016/5/9/chartex" xmlns:cx4="http://schemas.microsoft.com/office/drawing/2016/5/10/chartex" xmlns:cx5="http://schemas.microsoft.com/office/drawing/2016/5/11/chartex" xmlns:cx6="http://schemas.microsoft.com/office/drawing/2016/5/12/chartex" xmlns:cx7="http://schemas.microsoft.com/office/drawing/2016/5/13/chartex" xmlns:cx8="http://schemas.microsoft.com/office/drawing/2016/5/14/chartex" xmlns:mc="http://schemas.openxmlformats.org/markup-compatibility/2006" xmlns:m="http://schemas.openxmlformats.org/officeDocument/2006/math" xmlns:aink="http://schemas.microsoft.com/office/drawing/2016/ink" xmlns:am3d="http://schemas.microsoft.com/office/drawing/2017/model3d" xmlns:oel="http://schemas.microsoft.com/office/2019/extlst" xmlns:r="http://schemas.openxmlformats.org/officeDocument/2006/relationships" xmlns:wp14="http://schemas.microsoft.com/office/word/2010/wordprocessingDrawing" xmlns:wp="http://schemas.openxmlformats.org/drawingml/2006/wordprocessingDrawing" xmlns:wpg="http://schemas.microsoft.com/office/word/2010/wordprocessingGroup" xmlns:wpi="http://schemas.microsoft.com/office/word/2010/wordprocessingInk" xmlns:wps="http://schemas.microsoft.com/office/word/2010/wordprocessingShape" xmlns:o="urn:schemas-microsoft-com:office:office" xmlns:v="urn:schemas-microsoft-com:vml" xmlns:w10="urn:schemas-microsoft-com:office:word" xmlns:w="http://schemas.openxmlformats.org/wordprocessingml/2006/main" xmlns:w14="http://schemas.microsoft.com/office/word/2010/wordml" xmlns:w15="http://schemas.microsoft.com/office/word/2012/wordml" xmlns:w16cex="http://schemas.microsoft.com/office/word/2018/wordml/cex" xmlns:w16cid="http://schemas.microsoft.com/office/word/2016/wordml/cid" xmlns:w16="http://schemas.microsoft.com/office/word/2018/wordml" xmlns:w16sdtdh="http://schemas.microsoft.com/office/word/2020/wordml/sdtdatahash" xmlns:w16sdtfl="http://schemas.microsoft.com/office/word/2024/wordml/sdtformatlock" xmlns:w16se="http://schemas.microsoft.com/office/word/2015/wordml/symex" xmlns:w16du="http://schemas.microsoft.com/office/word/2023/wordml/word16du" xmlns:wne="http://schemas.microsoft.com/office/word/2006/wordml" mc:Ignorable="w14 w15 w16se w16cid w16 w16cex w16sdtdh w16sdtfl w16du wp14">
   <w:footnote w:type="separator" w:id="-1">
     <w:p>
       <w:pPr>
@@ -181,7 +181,7 @@
 </file>
 
 <file path=word/numbering.xml><?xml version="1.0" encoding="utf-8"?>
-<w:numbering xmlns:wpc="http://schemas.microsoft.com/office/word/2010/wordprocessingCanvas" xmlns:cx="http://schemas.microsoft.com/office/drawing/2014/chartex" xmlns:cx1="http://schemas.microsoft.com/office/drawing/2015/9/8/chartex" xmlns:cx2="http://schemas.microsoft.com/office/drawing/2015/10/21/chartex" xmlns:cx3="http://schemas.microsoft.com/office/drawing/2016/5/9/chartex" xmlns:cx4="http://schemas.microsoft.com/office/drawing/2016/5/10/chartex" xmlns:cx5="http://schemas.microsoft.com/office/drawing/2016/5/11/chartex" xmlns:cx6="http://schemas.microsoft.com/office/drawing/2016/5/12/chartex" xmlns:cx7="http://schemas.microsoft.com/office/drawing/2016/5/13/chartex" xmlns:cx8="http://schemas.microsoft.com/office/drawing/2016/5/14/chartex" xmlns:mc="http://schemas.openxmlformats.org/markup-compatibility/2006" xmlns:aink="http://schemas.microsoft.com/office/drawing/2016/ink" xmlns:am3d="http://schemas.microsoft.com/office/drawing/2017/model3d" xmlns:o="urn:schemas-microsoft-com:office:office" xmlns:oel="http://schemas.microsoft.com/office/2019/extlst" xmlns:r="http://schemas.openxmlformats.org/officeDocument/2006/relationships" xmlns:m="http://schemas.openxmlformats.org/officeDocument/2006/math" xmlns:v="urn:schemas-microsoft-com:vml" xmlns:wp14="http://schemas.microsoft.com/office/word/2010/wordprocessingDrawing" xmlns:wp="http://schemas.openxmlformats.org/drawingml/2006/wordprocessingDrawing" xmlns:w10="urn:schemas-microsoft-com:office:word" xmlns:w="http://schemas.openxmlformats.org/wordprocessingml/2006/main" xmlns:w14="http://schemas.microsoft.com/office/word/2010/wordml" xmlns:w15="http://schemas.microsoft.com/office/word/2012/wordml" xmlns:w16cex="http://schemas.microsoft.com/office/word/2018/wordml/cex" xmlns:w16cid="http://schemas.microsoft.com/office/word/2016/wordml/cid" xmlns:w16="http://schemas.microsoft.com/office/word/2018/wordml" xmlns:w16du="http://schemas.microsoft.com/office/word/2023/wordml/word16du" xmlns:w16sdtdh="http://schemas.microsoft.com/office/word/2020/wordml/sdtdatahash" xmlns:w16sdtfl="http://schemas.microsoft.com/office/word/2024/wordml/sdtformatlock" xmlns:w16se="http://schemas.microsoft.com/office/word/2015/wordml/symex" xmlns:wpg="http://schemas.microsoft.com/office/word/2010/wordprocessingGroup" xmlns:wpi="http://schemas.microsoft.com/office/word/2010/wordprocessingInk" xmlns:wne="http://schemas.microsoft.com/office/word/2006/wordml" xmlns:wps="http://schemas.microsoft.com/office/word/2010/wordprocessingShape" mc:Ignorable="w14 w15 w16se w16cid w16 w16cex w16sdtdh w16sdtfl w16du wp14">
+<w:numbering xmlns:wpc="http://schemas.microsoft.com/office/word/2010/wordprocessingCanvas" xmlns:cx="http://schemas.microsoft.com/office/drawing/2014/chartex" xmlns:cx1="http://schemas.microsoft.com/office/drawing/2015/9/8/chartex" xmlns:cx2="http://schemas.microsoft.com/office/drawing/2015/10/21/chartex" xmlns:cx3="http://schemas.microsoft.com/office/drawing/2016/5/9/chartex" xmlns:cx4="http://schemas.microsoft.com/office/drawing/2016/5/10/chartex" xmlns:cx5="http://schemas.microsoft.com/office/drawing/2016/5/11/chartex" xmlns:cx6="http://schemas.microsoft.com/office/drawing/2016/5/12/chartex" xmlns:cx7="http://schemas.microsoft.com/office/drawing/2016/5/13/chartex" xmlns:cx8="http://schemas.microsoft.com/office/drawing/2016/5/14/chartex" xmlns:mc="http://schemas.openxmlformats.org/markup-compatibility/2006" xmlns:m="http://schemas.openxmlformats.org/officeDocument/2006/math" xmlns:aink="http://schemas.microsoft.com/office/drawing/2016/ink" xmlns:am3d="http://schemas.microsoft.com/office/drawing/2017/model3d" xmlns:oel="http://schemas.microsoft.com/office/2019/extlst" xmlns:r="http://schemas.openxmlformats.org/officeDocument/2006/relationships" xmlns:wp14="http://schemas.microsoft.com/office/word/2010/wordprocessingDrawing" xmlns:wp="http://schemas.openxmlformats.org/drawingml/2006/wordprocessingDrawing" xmlns:wpg="http://schemas.microsoft.com/office/word/2010/wordprocessingGroup" xmlns:wpi="http://schemas.microsoft.com/office/word/2010/wordprocessingInk" xmlns:wps="http://schemas.microsoft.com/office/word/2010/wordprocessingShape" xmlns:o="urn:schemas-microsoft-com:office:office" xmlns:v="urn:schemas-microsoft-com:vml" xmlns:w10="urn:schemas-microsoft-com:office:word" xmlns:w="http://schemas.openxmlformats.org/wordprocessingml/2006/main" xmlns:w14="http://schemas.microsoft.com/office/word/2010/wordml" xmlns:w15="http://schemas.microsoft.com/office/word/2012/wordml" xmlns:w16cex="http://schemas.microsoft.com/office/word/2018/wordml/cex" xmlns:w16cid="http://schemas.microsoft.com/office/word/2016/wordml/cid" xmlns:w16="http://schemas.microsoft.com/office/word/2018/wordml" xmlns:w16sdtdh="http://schemas.microsoft.com/office/word/2020/wordml/sdtdatahash" xmlns:w16sdtfl="http://schemas.microsoft.com/office/word/2024/wordml/sdtformatlock" xmlns:w16se="http://schemas.microsoft.com/office/word/2015/wordml/symex" xmlns:w16du="http://schemas.microsoft.com/office/word/2023/wordml/word16du" xmlns:wne="http://schemas.microsoft.com/office/word/2006/wordml" mc:Ignorable="w14 w15 w16se w16cid w16 w16cex w16sdtdh w16sdtfl w16du wp14">
   <w:abstractNum w:abstractNumId="0" w15:restartNumberingAfterBreak="0">
     <w:nsid w:val="05B47AD0"/>
     <w:multiLevelType w:val="hybridMultilevel"/>
@@ -1906,7 +1906,7 @@
 </file>
 
 <file path=word/styles.xml><?xml version="1.0" encoding="utf-8"?>
-<w:styles xmlns:mc="http://schemas.openxmlformats.org/markup-compatibility/2006" xmlns:r="http://schemas.openxmlformats.org/officeDocument/2006/relationships" xmlns:w="http://schemas.openxmlformats.org/wordprocessingml/2006/main" xmlns:w14="http://schemas.microsoft.com/office/word/2010/wordml" xmlns:w15="http://schemas.microsoft.com/office/word/2012/wordml" xmlns:w16cex="http://schemas.microsoft.com/office/word/2018/wordml/cex" xmlns:w16cid="http://schemas.microsoft.com/office/word/2016/wordml/cid" xmlns:w16="http://schemas.microsoft.com/office/word/2018/wordml" xmlns:w16du="http://schemas.microsoft.com/office/word/2023/wordml/word16du" xmlns:w16sdtdh="http://schemas.microsoft.com/office/word/2020/wordml/sdtdatahash" xmlns:w16sdtfl="http://schemas.microsoft.com/office/word/2024/wordml/sdtformatlock" xmlns:w16se="http://schemas.microsoft.com/office/word/2015/wordml/symex" mc:Ignorable="w14 w15 w16se w16cid w16 w16cex w16sdtdh w16sdtfl w16du">
+<w:styles xmlns:mc="http://schemas.openxmlformats.org/markup-compatibility/2006" xmlns:r="http://schemas.openxmlformats.org/officeDocument/2006/relationships" xmlns:w="http://schemas.openxmlformats.org/wordprocessingml/2006/main" xmlns:w14="http://schemas.microsoft.com/office/word/2010/wordml" xmlns:w15="http://schemas.microsoft.com/office/word/2012/wordml" xmlns:w16cex="http://schemas.microsoft.com/office/word/2018/wordml/cex" xmlns:w16cid="http://schemas.microsoft.com/office/word/2016/wordml/cid" xmlns:w16="http://schemas.microsoft.com/office/word/2018/wordml" xmlns:w16sdtdh="http://schemas.microsoft.com/office/word/2020/wordml/sdtdatahash" xmlns:w16sdtfl="http://schemas.microsoft.com/office/word/2024/wordml/sdtformatlock" xmlns:w16se="http://schemas.microsoft.com/office/word/2015/wordml/symex" xmlns:w16du="http://schemas.microsoft.com/office/word/2023/wordml/word16du" mc:Ignorable="w14 w15 w16se w16cid w16 w16cex w16sdtdh w16sdtfl w16du">
   <w:docDefaults>
     <w:rPrDefault>
       <w:rPr>
@@ -3220,6 +3220,19 @@
       </w:numPr>
     </w:pPr>
   </w:style>
+  <w:style w:type="paragraph" w:customStyle="1" w:styleId="Code">
+    <w:name w:val="Code"/>
+    <w:basedOn w:val="Standaard"/>
+    <w:qFormat/>
+    <w:rsid w:val="000F128A"/>
+    <w:pPr>
+      <w:keepLines/>
+      <w:shd w:val="clear" w:color="auto" w:fill="E7E6E6" w:themeFill="background2"/>
+    </w:pPr>
+    <w:rPr>
+      <w:rFonts w:ascii="Fira Code" w:hAnsi="Fira Code"/>
+    </w:rPr>
+  </w:style>
 </w:styles>
 </file>
 

</xml_diff>

<commit_message>
Kwaliteitsplantemplate uitgebreid met dependency beheer
- Paragraaf toegevoegd om te beschrijven hoe het project het beheer van dependencies uitvoert.
- Bijlage toegevoegd met de ICTU-spelregels voor het beheer van dependencies.

Implementeert #392 deels.
</commit_message>
<xml_diff>
--- a/DocumentDefinitions/reference-ictu.docx
+++ b/DocumentDefinitions/reference-ictu.docx
@@ -651,89 +651,126 @@
   </w:abstractNum>
   <w:abstractNum w:abstractNumId="5" w15:restartNumberingAfterBreak="0">
     <w:nsid w:val="21590C63"/>
-    <w:multiLevelType w:val="hybridMultilevel"/>
-    <w:tmpl w:val="D0A00E12"/>
-    <w:lvl w:ilvl="0" w:tplc="5ED45EA4">
+    <w:multiLevelType w:val="multilevel"/>
+    <w:tmpl w:val="1528E658"/>
+    <w:lvl w:ilvl="0">
+      <w:start w:val="1"/>
+      <w:numFmt w:val="decimal"/>
+      <w:suff w:val="space"/>
+      <w:lvlText w:val="Hoofdstuk %1"/>
+      <w:lvlJc w:val="left"/>
+      <w:pPr>
+        <w:ind w:left="0" w:firstLine="0"/>
+      </w:pPr>
+      <w:rPr>
+        <w:rFonts w:hint="default"/>
+      </w:rPr>
+    </w:lvl>
+    <w:lvl w:ilvl="1">
+      <w:start w:val="1"/>
+      <w:numFmt w:val="upperLetter"/>
+      <w:pStyle w:val="Kop2Bijlage"/>
+      <w:suff w:val="nothing"/>
+      <w:lvlText w:val="%2 "/>
+      <w:lvlJc w:val="left"/>
+      <w:pPr>
+        <w:ind w:left="0" w:firstLine="0"/>
+      </w:pPr>
+      <w:rPr>
+        <w:rFonts w:hint="default"/>
+      </w:rPr>
+    </w:lvl>
+    <w:lvl w:ilvl="2">
       <w:start w:val="1"/>
       <w:numFmt w:val="decimal"/>
       <w:pStyle w:val="Kop3Bijlage"/>
-      <w:lvlText w:val="%1."/>
-      <w:lvlJc w:val="left"/>
-      <w:pPr>
-        <w:ind w:left="720" w:hanging="360"/>
-      </w:pPr>
-    </w:lvl>
-    <w:lvl w:ilvl="1" w:tplc="04130019" w:tentative="1">
-      <w:start w:val="1"/>
-      <w:numFmt w:val="lowerLetter"/>
-      <w:lvlText w:val="%2."/>
-      <w:lvlJc w:val="left"/>
-      <w:pPr>
-        <w:ind w:left="1440" w:hanging="360"/>
-      </w:pPr>
-    </w:lvl>
-    <w:lvl w:ilvl="2" w:tplc="0413001B" w:tentative="1">
-      <w:start w:val="1"/>
-      <w:numFmt w:val="lowerRoman"/>
-      <w:lvlText w:val="%3."/>
-      <w:lvlJc w:val="right"/>
-      <w:pPr>
-        <w:ind w:left="2160" w:hanging="180"/>
-      </w:pPr>
-    </w:lvl>
-    <w:lvl w:ilvl="3" w:tplc="0413000F" w:tentative="1">
-      <w:start w:val="1"/>
-      <w:numFmt w:val="decimal"/>
-      <w:lvlText w:val="%4."/>
-      <w:lvlJc w:val="left"/>
-      <w:pPr>
-        <w:ind w:left="2880" w:hanging="360"/>
-      </w:pPr>
-    </w:lvl>
-    <w:lvl w:ilvl="4" w:tplc="04130019" w:tentative="1">
-      <w:start w:val="1"/>
-      <w:numFmt w:val="lowerLetter"/>
-      <w:lvlText w:val="%5."/>
-      <w:lvlJc w:val="left"/>
-      <w:pPr>
-        <w:ind w:left="3600" w:hanging="360"/>
-      </w:pPr>
-    </w:lvl>
-    <w:lvl w:ilvl="5" w:tplc="0413001B" w:tentative="1">
-      <w:start w:val="1"/>
-      <w:numFmt w:val="lowerRoman"/>
-      <w:lvlText w:val="%6."/>
-      <w:lvlJc w:val="right"/>
-      <w:pPr>
-        <w:ind w:left="4320" w:hanging="180"/>
-      </w:pPr>
-    </w:lvl>
-    <w:lvl w:ilvl="6" w:tplc="0413000F" w:tentative="1">
-      <w:start w:val="1"/>
-      <w:numFmt w:val="decimal"/>
-      <w:lvlText w:val="%7."/>
-      <w:lvlJc w:val="left"/>
-      <w:pPr>
-        <w:ind w:left="5040" w:hanging="360"/>
-      </w:pPr>
-    </w:lvl>
-    <w:lvl w:ilvl="7" w:tplc="04130019" w:tentative="1">
-      <w:start w:val="1"/>
-      <w:numFmt w:val="lowerLetter"/>
-      <w:lvlText w:val="%8."/>
-      <w:lvlJc w:val="left"/>
-      <w:pPr>
-        <w:ind w:left="5760" w:hanging="360"/>
-      </w:pPr>
-    </w:lvl>
-    <w:lvl w:ilvl="8" w:tplc="0413001B" w:tentative="1">
-      <w:start w:val="1"/>
-      <w:numFmt w:val="lowerRoman"/>
-      <w:lvlText w:val="%9."/>
-      <w:lvlJc w:val="right"/>
-      <w:pPr>
-        <w:ind w:left="6480" w:hanging="180"/>
-      </w:pPr>
+      <w:suff w:val="nothing"/>
+      <w:lvlText w:val="%3 "/>
+      <w:lvlJc w:val="left"/>
+      <w:pPr>
+        <w:ind w:left="0" w:firstLine="0"/>
+      </w:pPr>
+      <w:rPr>
+        <w:rFonts w:hint="default"/>
+      </w:rPr>
+    </w:lvl>
+    <w:lvl w:ilvl="3">
+      <w:start w:val="1"/>
+      <w:numFmt w:val="none"/>
+      <w:suff w:val="nothing"/>
+      <w:lvlText w:val=""/>
+      <w:lvlJc w:val="left"/>
+      <w:pPr>
+        <w:ind w:left="0" w:firstLine="0"/>
+      </w:pPr>
+      <w:rPr>
+        <w:rFonts w:hint="default"/>
+      </w:rPr>
+    </w:lvl>
+    <w:lvl w:ilvl="4">
+      <w:start w:val="1"/>
+      <w:numFmt w:val="none"/>
+      <w:suff w:val="nothing"/>
+      <w:lvlText w:val=""/>
+      <w:lvlJc w:val="left"/>
+      <w:pPr>
+        <w:ind w:left="0" w:firstLine="0"/>
+      </w:pPr>
+      <w:rPr>
+        <w:rFonts w:hint="default"/>
+      </w:rPr>
+    </w:lvl>
+    <w:lvl w:ilvl="5">
+      <w:start w:val="1"/>
+      <w:numFmt w:val="none"/>
+      <w:suff w:val="nothing"/>
+      <w:lvlText w:val=""/>
+      <w:lvlJc w:val="left"/>
+      <w:pPr>
+        <w:ind w:left="0" w:firstLine="0"/>
+      </w:pPr>
+      <w:rPr>
+        <w:rFonts w:hint="default"/>
+      </w:rPr>
+    </w:lvl>
+    <w:lvl w:ilvl="6">
+      <w:start w:val="1"/>
+      <w:numFmt w:val="none"/>
+      <w:suff w:val="nothing"/>
+      <w:lvlText w:val=""/>
+      <w:lvlJc w:val="left"/>
+      <w:pPr>
+        <w:ind w:left="0" w:firstLine="0"/>
+      </w:pPr>
+      <w:rPr>
+        <w:rFonts w:hint="default"/>
+      </w:rPr>
+    </w:lvl>
+    <w:lvl w:ilvl="7">
+      <w:start w:val="1"/>
+      <w:numFmt w:val="none"/>
+      <w:suff w:val="nothing"/>
+      <w:lvlText w:val=""/>
+      <w:lvlJc w:val="left"/>
+      <w:pPr>
+        <w:ind w:left="0" w:firstLine="0"/>
+      </w:pPr>
+      <w:rPr>
+        <w:rFonts w:hint="default"/>
+      </w:rPr>
+    </w:lvl>
+    <w:lvl w:ilvl="8">
+      <w:start w:val="1"/>
+      <w:numFmt w:val="none"/>
+      <w:suff w:val="nothing"/>
+      <w:lvlText w:val=""/>
+      <w:lvlJc w:val="left"/>
+      <w:pPr>
+        <w:ind w:left="0" w:firstLine="0"/>
+      </w:pPr>
+      <w:rPr>
+        <w:rFonts w:hint="default"/>
+      </w:rPr>
     </w:lvl>
   </w:abstractNum>
   <w:abstractNum w:abstractNumId="6" w15:restartNumberingAfterBreak="0">
@@ -911,6 +948,93 @@
     </w:lvl>
   </w:abstractNum>
   <w:abstractNum w:abstractNumId="8" w15:restartNumberingAfterBreak="0">
+    <w:nsid w:val="42A91E45"/>
+    <w:multiLevelType w:val="multilevel"/>
+    <w:tmpl w:val="0413001D"/>
+    <w:styleLink w:val="Huidigelijst7"/>
+    <w:lvl w:ilvl="0">
+      <w:start w:val="1"/>
+      <w:numFmt w:val="decimal"/>
+      <w:lvlText w:val="%1)"/>
+      <w:lvlJc w:val="left"/>
+      <w:pPr>
+        <w:ind w:left="360" w:hanging="360"/>
+      </w:pPr>
+    </w:lvl>
+    <w:lvl w:ilvl="1">
+      <w:start w:val="1"/>
+      <w:numFmt w:val="lowerLetter"/>
+      <w:lvlText w:val="%2)"/>
+      <w:lvlJc w:val="left"/>
+      <w:pPr>
+        <w:ind w:left="720" w:hanging="360"/>
+      </w:pPr>
+    </w:lvl>
+    <w:lvl w:ilvl="2">
+      <w:start w:val="1"/>
+      <w:numFmt w:val="lowerRoman"/>
+      <w:lvlText w:val="%3)"/>
+      <w:lvlJc w:val="left"/>
+      <w:pPr>
+        <w:ind w:left="1080" w:hanging="360"/>
+      </w:pPr>
+    </w:lvl>
+    <w:lvl w:ilvl="3">
+      <w:start w:val="1"/>
+      <w:numFmt w:val="decimal"/>
+      <w:lvlText w:val="(%4)"/>
+      <w:lvlJc w:val="left"/>
+      <w:pPr>
+        <w:ind w:left="1440" w:hanging="360"/>
+      </w:pPr>
+    </w:lvl>
+    <w:lvl w:ilvl="4">
+      <w:start w:val="1"/>
+      <w:numFmt w:val="lowerLetter"/>
+      <w:lvlText w:val="(%5)"/>
+      <w:lvlJc w:val="left"/>
+      <w:pPr>
+        <w:ind w:left="1800" w:hanging="360"/>
+      </w:pPr>
+    </w:lvl>
+    <w:lvl w:ilvl="5">
+      <w:start w:val="1"/>
+      <w:numFmt w:val="lowerRoman"/>
+      <w:lvlText w:val="(%6)"/>
+      <w:lvlJc w:val="left"/>
+      <w:pPr>
+        <w:ind w:left="2160" w:hanging="360"/>
+      </w:pPr>
+    </w:lvl>
+    <w:lvl w:ilvl="6">
+      <w:start w:val="1"/>
+      <w:numFmt w:val="decimal"/>
+      <w:lvlText w:val="%7."/>
+      <w:lvlJc w:val="left"/>
+      <w:pPr>
+        <w:ind w:left="2520" w:hanging="360"/>
+      </w:pPr>
+    </w:lvl>
+    <w:lvl w:ilvl="7">
+      <w:start w:val="1"/>
+      <w:numFmt w:val="lowerLetter"/>
+      <w:lvlText w:val="%8."/>
+      <w:lvlJc w:val="left"/>
+      <w:pPr>
+        <w:ind w:left="2880" w:hanging="360"/>
+      </w:pPr>
+    </w:lvl>
+    <w:lvl w:ilvl="8">
+      <w:start w:val="1"/>
+      <w:numFmt w:val="lowerRoman"/>
+      <w:lvlText w:val="%9."/>
+      <w:lvlJc w:val="left"/>
+      <w:pPr>
+        <w:ind w:left="3240" w:hanging="360"/>
+      </w:pPr>
+    </w:lvl>
+  </w:abstractNum>
+  <w:abstractNum w:abstractNumId="9" w15:restartNumberingAfterBreak="0">
     <w:nsid w:val="4BD85229"/>
     <w:multiLevelType w:val="multilevel"/>
     <w:tmpl w:val="0413001D"/>
@@ -996,7 +1120,7 @@
       </w:pPr>
     </w:lvl>
   </w:abstractNum>
-  <w:abstractNum w:abstractNumId="9" w15:restartNumberingAfterBreak="0">
+  <w:abstractNum w:abstractNumId="10" w15:restartNumberingAfterBreak="0">
     <w:nsid w:val="53DF4A24"/>
     <w:multiLevelType w:val="hybridMultilevel"/>
     <w:tmpl w:val="C4B4E148"/>
@@ -1110,7 +1234,7 @@
       </w:rPr>
     </w:lvl>
   </w:abstractNum>
-  <w:abstractNum w:abstractNumId="10" w15:restartNumberingAfterBreak="0">
+  <w:abstractNum w:abstractNumId="11" w15:restartNumberingAfterBreak="0">
     <w:nsid w:val="599D25BF"/>
     <w:multiLevelType w:val="multilevel"/>
     <w:tmpl w:val="0413001D"/>
@@ -1197,7 +1321,7 @@
       </w:pPr>
     </w:lvl>
   </w:abstractNum>
-  <w:abstractNum w:abstractNumId="11" w15:restartNumberingAfterBreak="0">
+  <w:abstractNum w:abstractNumId="12" w15:restartNumberingAfterBreak="0">
     <w:nsid w:val="63B14832"/>
     <w:multiLevelType w:val="multilevel"/>
     <w:tmpl w:val="DC925A50"/>
@@ -1454,7 +1578,7 @@
       </w:pPr>
     </w:lvl>
   </w:abstractNum>
-  <w:abstractNum w:abstractNumId="12" w15:restartNumberingAfterBreak="0">
+  <w:abstractNum w:abstractNumId="13" w15:restartNumberingAfterBreak="0">
     <w:nsid w:val="65466FE6"/>
     <w:multiLevelType w:val="multilevel"/>
     <w:tmpl w:val="545E19F4"/>
@@ -1567,7 +1691,7 @@
       </w:rPr>
     </w:lvl>
   </w:abstractNum>
-  <w:abstractNum w:abstractNumId="13" w15:restartNumberingAfterBreak="0">
+  <w:abstractNum w:abstractNumId="14" w15:restartNumberingAfterBreak="0">
     <w:nsid w:val="67A6292A"/>
     <w:multiLevelType w:val="multilevel"/>
     <w:tmpl w:val="0413001D"/>
@@ -1654,7 +1778,7 @@
       </w:pPr>
     </w:lvl>
   </w:abstractNum>
-  <w:abstractNum w:abstractNumId="14" w15:restartNumberingAfterBreak="0">
+  <w:abstractNum w:abstractNumId="15" w15:restartNumberingAfterBreak="0">
     <w:nsid w:val="70216547"/>
     <w:multiLevelType w:val="hybridMultilevel"/>
     <w:tmpl w:val="97868FF8"/>
@@ -1767,14 +1891,13 @@
       </w:rPr>
     </w:lvl>
   </w:abstractNum>
-  <w:abstractNum w:abstractNumId="15" w15:restartNumberingAfterBreak="0">
+  <w:abstractNum w:abstractNumId="16" w15:restartNumberingAfterBreak="0">
     <w:nsid w:val="79922B74"/>
     <w:multiLevelType w:val="hybridMultilevel"/>
-    <w:tmpl w:val="060089B0"/>
+    <w:tmpl w:val="4F8AEAC2"/>
     <w:lvl w:ilvl="0" w:tplc="B276DD4A">
       <w:start w:val="1"/>
       <w:numFmt w:val="upperLetter"/>
-      <w:pStyle w:val="Kop2Bijlage"/>
       <w:lvlText w:val="%1."/>
       <w:lvlJc w:val="left"/>
       <w:pPr>
@@ -1855,19 +1978,19 @@
     </w:lvl>
   </w:abstractNum>
   <w:num w:numId="1" w16cid:durableId="800925187">
-    <w:abstractNumId w:val="14"/>
+    <w:abstractNumId w:val="15"/>
   </w:num>
   <w:num w:numId="2" w16cid:durableId="1047990498">
-    <w:abstractNumId w:val="9"/>
+    <w:abstractNumId w:val="10"/>
   </w:num>
   <w:num w:numId="3" w16cid:durableId="1396275024">
     <w:abstractNumId w:val="0"/>
   </w:num>
   <w:num w:numId="4" w16cid:durableId="138890979">
-    <w:abstractNumId w:val="11"/>
+    <w:abstractNumId w:val="12"/>
   </w:num>
   <w:num w:numId="5" w16cid:durableId="595135806">
-    <w:abstractNumId w:val="15"/>
+    <w:abstractNumId w:val="16"/>
   </w:num>
   <w:num w:numId="6" w16cid:durableId="731928053">
     <w:abstractNumId w:val="6"/>
@@ -1876,19 +1999,19 @@
     <w:abstractNumId w:val="5"/>
   </w:num>
   <w:num w:numId="8" w16cid:durableId="1287271727">
-    <w:abstractNumId w:val="8"/>
+    <w:abstractNumId w:val="9"/>
   </w:num>
   <w:num w:numId="9" w16cid:durableId="1309507343">
     <w:abstractNumId w:val="7"/>
   </w:num>
   <w:num w:numId="10" w16cid:durableId="1152327888">
-    <w:abstractNumId w:val="12"/>
+    <w:abstractNumId w:val="13"/>
   </w:num>
   <w:num w:numId="11" w16cid:durableId="800075389">
-    <w:abstractNumId w:val="13"/>
+    <w:abstractNumId w:val="14"/>
   </w:num>
   <w:num w:numId="12" w16cid:durableId="603154256">
-    <w:abstractNumId w:val="10"/>
+    <w:abstractNumId w:val="11"/>
   </w:num>
   <w:num w:numId="13" w16cid:durableId="448620866">
     <w:abstractNumId w:val="1"/>
@@ -1901,6 +2024,9 @@
   </w:num>
   <w:num w:numId="16" w16cid:durableId="1919708142">
     <w:abstractNumId w:val="2"/>
+  </w:num>
+  <w:num w:numId="17" w16cid:durableId="1414007476">
+    <w:abstractNumId w:val="8"/>
   </w:num>
 </w:numbering>
 </file>
@@ -2957,8 +3083,7 @@
     <w:rsid w:val="00EE285D"/>
     <w:pPr>
       <w:numPr>
-        <w:ilvl w:val="0"/>
-        <w:numId w:val="5"/>
+        <w:numId w:val="7"/>
       </w:numPr>
     </w:pPr>
   </w:style>
@@ -2994,13 +3119,11 @@
     <w:next w:val="Standaard"/>
     <w:link w:val="Kop3BijlageChar"/>
     <w:qFormat/>
-    <w:rsid w:val="00CB3BB6"/>
+    <w:rsid w:val="00DB1051"/>
     <w:pPr>
       <w:numPr>
-        <w:ilvl w:val="0"/>
         <w:numId w:val="7"/>
       </w:numPr>
-      <w:ind w:left="357" w:hanging="357"/>
     </w:pPr>
   </w:style>
   <w:style w:type="paragraph" w:customStyle="1" w:styleId="Maatregel">
@@ -3233,6 +3356,16 @@
       <w:rFonts w:ascii="Fira Code" w:hAnsi="Fira Code"/>
       <w:sz w:val="18"/>
     </w:rPr>
+  </w:style>
+  <w:style w:type="numbering" w:customStyle="1" w:styleId="Huidigelijst7">
+    <w:name w:val="Huidige lijst7"/>
+    <w:uiPriority w:val="99"/>
+    <w:rsid w:val="00DB1051"/>
+    <w:pPr>
+      <w:numPr>
+        <w:numId w:val="17"/>
+      </w:numPr>
+    </w:pPr>
   </w:style>
 </w:styles>
 </file>

</xml_diff>

<commit_message>
Kwaliteitsplantemplate uitgebreid met dependency beheer (#1253)
- Paragraaf toegevoegd om te beschrijven hoe het project het beheer van dependencies uitvoert.
- Bijlage toegevoegd met de ICTU-spelregels voor het beheer van dependencies.

Implementeert #392 deels.
</commit_message>
<xml_diff>
--- a/DocumentDefinitions/reference-ictu.docx
+++ b/DocumentDefinitions/reference-ictu.docx
@@ -651,89 +651,126 @@
   </w:abstractNum>
   <w:abstractNum w:abstractNumId="5" w15:restartNumberingAfterBreak="0">
     <w:nsid w:val="21590C63"/>
-    <w:multiLevelType w:val="hybridMultilevel"/>
-    <w:tmpl w:val="D0A00E12"/>
-    <w:lvl w:ilvl="0" w:tplc="5ED45EA4">
+    <w:multiLevelType w:val="multilevel"/>
+    <w:tmpl w:val="1528E658"/>
+    <w:lvl w:ilvl="0">
+      <w:start w:val="1"/>
+      <w:numFmt w:val="decimal"/>
+      <w:suff w:val="space"/>
+      <w:lvlText w:val="Hoofdstuk %1"/>
+      <w:lvlJc w:val="left"/>
+      <w:pPr>
+        <w:ind w:left="0" w:firstLine="0"/>
+      </w:pPr>
+      <w:rPr>
+        <w:rFonts w:hint="default"/>
+      </w:rPr>
+    </w:lvl>
+    <w:lvl w:ilvl="1">
+      <w:start w:val="1"/>
+      <w:numFmt w:val="upperLetter"/>
+      <w:pStyle w:val="Kop2Bijlage"/>
+      <w:suff w:val="nothing"/>
+      <w:lvlText w:val="%2 "/>
+      <w:lvlJc w:val="left"/>
+      <w:pPr>
+        <w:ind w:left="0" w:firstLine="0"/>
+      </w:pPr>
+      <w:rPr>
+        <w:rFonts w:hint="default"/>
+      </w:rPr>
+    </w:lvl>
+    <w:lvl w:ilvl="2">
       <w:start w:val="1"/>
       <w:numFmt w:val="decimal"/>
       <w:pStyle w:val="Kop3Bijlage"/>
-      <w:lvlText w:val="%1."/>
-      <w:lvlJc w:val="left"/>
-      <w:pPr>
-        <w:ind w:left="720" w:hanging="360"/>
-      </w:pPr>
-    </w:lvl>
-    <w:lvl w:ilvl="1" w:tplc="04130019" w:tentative="1">
-      <w:start w:val="1"/>
-      <w:numFmt w:val="lowerLetter"/>
-      <w:lvlText w:val="%2."/>
-      <w:lvlJc w:val="left"/>
-      <w:pPr>
-        <w:ind w:left="1440" w:hanging="360"/>
-      </w:pPr>
-    </w:lvl>
-    <w:lvl w:ilvl="2" w:tplc="0413001B" w:tentative="1">
-      <w:start w:val="1"/>
-      <w:numFmt w:val="lowerRoman"/>
-      <w:lvlText w:val="%3."/>
-      <w:lvlJc w:val="right"/>
-      <w:pPr>
-        <w:ind w:left="2160" w:hanging="180"/>
-      </w:pPr>
-    </w:lvl>
-    <w:lvl w:ilvl="3" w:tplc="0413000F" w:tentative="1">
-      <w:start w:val="1"/>
-      <w:numFmt w:val="decimal"/>
-      <w:lvlText w:val="%4."/>
-      <w:lvlJc w:val="left"/>
-      <w:pPr>
-        <w:ind w:left="2880" w:hanging="360"/>
-      </w:pPr>
-    </w:lvl>
-    <w:lvl w:ilvl="4" w:tplc="04130019" w:tentative="1">
-      <w:start w:val="1"/>
-      <w:numFmt w:val="lowerLetter"/>
-      <w:lvlText w:val="%5."/>
-      <w:lvlJc w:val="left"/>
-      <w:pPr>
-        <w:ind w:left="3600" w:hanging="360"/>
-      </w:pPr>
-    </w:lvl>
-    <w:lvl w:ilvl="5" w:tplc="0413001B" w:tentative="1">
-      <w:start w:val="1"/>
-      <w:numFmt w:val="lowerRoman"/>
-      <w:lvlText w:val="%6."/>
-      <w:lvlJc w:val="right"/>
-      <w:pPr>
-        <w:ind w:left="4320" w:hanging="180"/>
-      </w:pPr>
-    </w:lvl>
-    <w:lvl w:ilvl="6" w:tplc="0413000F" w:tentative="1">
-      <w:start w:val="1"/>
-      <w:numFmt w:val="decimal"/>
-      <w:lvlText w:val="%7."/>
-      <w:lvlJc w:val="left"/>
-      <w:pPr>
-        <w:ind w:left="5040" w:hanging="360"/>
-      </w:pPr>
-    </w:lvl>
-    <w:lvl w:ilvl="7" w:tplc="04130019" w:tentative="1">
-      <w:start w:val="1"/>
-      <w:numFmt w:val="lowerLetter"/>
-      <w:lvlText w:val="%8."/>
-      <w:lvlJc w:val="left"/>
-      <w:pPr>
-        <w:ind w:left="5760" w:hanging="360"/>
-      </w:pPr>
-    </w:lvl>
-    <w:lvl w:ilvl="8" w:tplc="0413001B" w:tentative="1">
-      <w:start w:val="1"/>
-      <w:numFmt w:val="lowerRoman"/>
-      <w:lvlText w:val="%9."/>
-      <w:lvlJc w:val="right"/>
-      <w:pPr>
-        <w:ind w:left="6480" w:hanging="180"/>
-      </w:pPr>
+      <w:suff w:val="nothing"/>
+      <w:lvlText w:val="%3 "/>
+      <w:lvlJc w:val="left"/>
+      <w:pPr>
+        <w:ind w:left="0" w:firstLine="0"/>
+      </w:pPr>
+      <w:rPr>
+        <w:rFonts w:hint="default"/>
+      </w:rPr>
+    </w:lvl>
+    <w:lvl w:ilvl="3">
+      <w:start w:val="1"/>
+      <w:numFmt w:val="none"/>
+      <w:suff w:val="nothing"/>
+      <w:lvlText w:val=""/>
+      <w:lvlJc w:val="left"/>
+      <w:pPr>
+        <w:ind w:left="0" w:firstLine="0"/>
+      </w:pPr>
+      <w:rPr>
+        <w:rFonts w:hint="default"/>
+      </w:rPr>
+    </w:lvl>
+    <w:lvl w:ilvl="4">
+      <w:start w:val="1"/>
+      <w:numFmt w:val="none"/>
+      <w:suff w:val="nothing"/>
+      <w:lvlText w:val=""/>
+      <w:lvlJc w:val="left"/>
+      <w:pPr>
+        <w:ind w:left="0" w:firstLine="0"/>
+      </w:pPr>
+      <w:rPr>
+        <w:rFonts w:hint="default"/>
+      </w:rPr>
+    </w:lvl>
+    <w:lvl w:ilvl="5">
+      <w:start w:val="1"/>
+      <w:numFmt w:val="none"/>
+      <w:suff w:val="nothing"/>
+      <w:lvlText w:val=""/>
+      <w:lvlJc w:val="left"/>
+      <w:pPr>
+        <w:ind w:left="0" w:firstLine="0"/>
+      </w:pPr>
+      <w:rPr>
+        <w:rFonts w:hint="default"/>
+      </w:rPr>
+    </w:lvl>
+    <w:lvl w:ilvl="6">
+      <w:start w:val="1"/>
+      <w:numFmt w:val="none"/>
+      <w:suff w:val="nothing"/>
+      <w:lvlText w:val=""/>
+      <w:lvlJc w:val="left"/>
+      <w:pPr>
+        <w:ind w:left="0" w:firstLine="0"/>
+      </w:pPr>
+      <w:rPr>
+        <w:rFonts w:hint="default"/>
+      </w:rPr>
+    </w:lvl>
+    <w:lvl w:ilvl="7">
+      <w:start w:val="1"/>
+      <w:numFmt w:val="none"/>
+      <w:suff w:val="nothing"/>
+      <w:lvlText w:val=""/>
+      <w:lvlJc w:val="left"/>
+      <w:pPr>
+        <w:ind w:left="0" w:firstLine="0"/>
+      </w:pPr>
+      <w:rPr>
+        <w:rFonts w:hint="default"/>
+      </w:rPr>
+    </w:lvl>
+    <w:lvl w:ilvl="8">
+      <w:start w:val="1"/>
+      <w:numFmt w:val="none"/>
+      <w:suff w:val="nothing"/>
+      <w:lvlText w:val=""/>
+      <w:lvlJc w:val="left"/>
+      <w:pPr>
+        <w:ind w:left="0" w:firstLine="0"/>
+      </w:pPr>
+      <w:rPr>
+        <w:rFonts w:hint="default"/>
+      </w:rPr>
     </w:lvl>
   </w:abstractNum>
   <w:abstractNum w:abstractNumId="6" w15:restartNumberingAfterBreak="0">
@@ -911,6 +948,93 @@
     </w:lvl>
   </w:abstractNum>
   <w:abstractNum w:abstractNumId="8" w15:restartNumberingAfterBreak="0">
+    <w:nsid w:val="42A91E45"/>
+    <w:multiLevelType w:val="multilevel"/>
+    <w:tmpl w:val="0413001D"/>
+    <w:styleLink w:val="Huidigelijst7"/>
+    <w:lvl w:ilvl="0">
+      <w:start w:val="1"/>
+      <w:numFmt w:val="decimal"/>
+      <w:lvlText w:val="%1)"/>
+      <w:lvlJc w:val="left"/>
+      <w:pPr>
+        <w:ind w:left="360" w:hanging="360"/>
+      </w:pPr>
+    </w:lvl>
+    <w:lvl w:ilvl="1">
+      <w:start w:val="1"/>
+      <w:numFmt w:val="lowerLetter"/>
+      <w:lvlText w:val="%2)"/>
+      <w:lvlJc w:val="left"/>
+      <w:pPr>
+        <w:ind w:left="720" w:hanging="360"/>
+      </w:pPr>
+    </w:lvl>
+    <w:lvl w:ilvl="2">
+      <w:start w:val="1"/>
+      <w:numFmt w:val="lowerRoman"/>
+      <w:lvlText w:val="%3)"/>
+      <w:lvlJc w:val="left"/>
+      <w:pPr>
+        <w:ind w:left="1080" w:hanging="360"/>
+      </w:pPr>
+    </w:lvl>
+    <w:lvl w:ilvl="3">
+      <w:start w:val="1"/>
+      <w:numFmt w:val="decimal"/>
+      <w:lvlText w:val="(%4)"/>
+      <w:lvlJc w:val="left"/>
+      <w:pPr>
+        <w:ind w:left="1440" w:hanging="360"/>
+      </w:pPr>
+    </w:lvl>
+    <w:lvl w:ilvl="4">
+      <w:start w:val="1"/>
+      <w:numFmt w:val="lowerLetter"/>
+      <w:lvlText w:val="(%5)"/>
+      <w:lvlJc w:val="left"/>
+      <w:pPr>
+        <w:ind w:left="1800" w:hanging="360"/>
+      </w:pPr>
+    </w:lvl>
+    <w:lvl w:ilvl="5">
+      <w:start w:val="1"/>
+      <w:numFmt w:val="lowerRoman"/>
+      <w:lvlText w:val="(%6)"/>
+      <w:lvlJc w:val="left"/>
+      <w:pPr>
+        <w:ind w:left="2160" w:hanging="360"/>
+      </w:pPr>
+    </w:lvl>
+    <w:lvl w:ilvl="6">
+      <w:start w:val="1"/>
+      <w:numFmt w:val="decimal"/>
+      <w:lvlText w:val="%7."/>
+      <w:lvlJc w:val="left"/>
+      <w:pPr>
+        <w:ind w:left="2520" w:hanging="360"/>
+      </w:pPr>
+    </w:lvl>
+    <w:lvl w:ilvl="7">
+      <w:start w:val="1"/>
+      <w:numFmt w:val="lowerLetter"/>
+      <w:lvlText w:val="%8."/>
+      <w:lvlJc w:val="left"/>
+      <w:pPr>
+        <w:ind w:left="2880" w:hanging="360"/>
+      </w:pPr>
+    </w:lvl>
+    <w:lvl w:ilvl="8">
+      <w:start w:val="1"/>
+      <w:numFmt w:val="lowerRoman"/>
+      <w:lvlText w:val="%9."/>
+      <w:lvlJc w:val="left"/>
+      <w:pPr>
+        <w:ind w:left="3240" w:hanging="360"/>
+      </w:pPr>
+    </w:lvl>
+  </w:abstractNum>
+  <w:abstractNum w:abstractNumId="9" w15:restartNumberingAfterBreak="0">
     <w:nsid w:val="4BD85229"/>
     <w:multiLevelType w:val="multilevel"/>
     <w:tmpl w:val="0413001D"/>
@@ -996,7 +1120,7 @@
       </w:pPr>
     </w:lvl>
   </w:abstractNum>
-  <w:abstractNum w:abstractNumId="9" w15:restartNumberingAfterBreak="0">
+  <w:abstractNum w:abstractNumId="10" w15:restartNumberingAfterBreak="0">
     <w:nsid w:val="53DF4A24"/>
     <w:multiLevelType w:val="hybridMultilevel"/>
     <w:tmpl w:val="C4B4E148"/>
@@ -1110,7 +1234,7 @@
       </w:rPr>
     </w:lvl>
   </w:abstractNum>
-  <w:abstractNum w:abstractNumId="10" w15:restartNumberingAfterBreak="0">
+  <w:abstractNum w:abstractNumId="11" w15:restartNumberingAfterBreak="0">
     <w:nsid w:val="599D25BF"/>
     <w:multiLevelType w:val="multilevel"/>
     <w:tmpl w:val="0413001D"/>
@@ -1197,7 +1321,7 @@
       </w:pPr>
     </w:lvl>
   </w:abstractNum>
-  <w:abstractNum w:abstractNumId="11" w15:restartNumberingAfterBreak="0">
+  <w:abstractNum w:abstractNumId="12" w15:restartNumberingAfterBreak="0">
     <w:nsid w:val="63B14832"/>
     <w:multiLevelType w:val="multilevel"/>
     <w:tmpl w:val="DC925A50"/>
@@ -1454,7 +1578,7 @@
       </w:pPr>
     </w:lvl>
   </w:abstractNum>
-  <w:abstractNum w:abstractNumId="12" w15:restartNumberingAfterBreak="0">
+  <w:abstractNum w:abstractNumId="13" w15:restartNumberingAfterBreak="0">
     <w:nsid w:val="65466FE6"/>
     <w:multiLevelType w:val="multilevel"/>
     <w:tmpl w:val="545E19F4"/>
@@ -1567,7 +1691,7 @@
       </w:rPr>
     </w:lvl>
   </w:abstractNum>
-  <w:abstractNum w:abstractNumId="13" w15:restartNumberingAfterBreak="0">
+  <w:abstractNum w:abstractNumId="14" w15:restartNumberingAfterBreak="0">
     <w:nsid w:val="67A6292A"/>
     <w:multiLevelType w:val="multilevel"/>
     <w:tmpl w:val="0413001D"/>
@@ -1654,7 +1778,7 @@
       </w:pPr>
     </w:lvl>
   </w:abstractNum>
-  <w:abstractNum w:abstractNumId="14" w15:restartNumberingAfterBreak="0">
+  <w:abstractNum w:abstractNumId="15" w15:restartNumberingAfterBreak="0">
     <w:nsid w:val="70216547"/>
     <w:multiLevelType w:val="hybridMultilevel"/>
     <w:tmpl w:val="97868FF8"/>
@@ -1767,14 +1891,13 @@
       </w:rPr>
     </w:lvl>
   </w:abstractNum>
-  <w:abstractNum w:abstractNumId="15" w15:restartNumberingAfterBreak="0">
+  <w:abstractNum w:abstractNumId="16" w15:restartNumberingAfterBreak="0">
     <w:nsid w:val="79922B74"/>
     <w:multiLevelType w:val="hybridMultilevel"/>
-    <w:tmpl w:val="060089B0"/>
+    <w:tmpl w:val="4F8AEAC2"/>
     <w:lvl w:ilvl="0" w:tplc="B276DD4A">
       <w:start w:val="1"/>
       <w:numFmt w:val="upperLetter"/>
-      <w:pStyle w:val="Kop2Bijlage"/>
       <w:lvlText w:val="%1."/>
       <w:lvlJc w:val="left"/>
       <w:pPr>
@@ -1855,19 +1978,19 @@
     </w:lvl>
   </w:abstractNum>
   <w:num w:numId="1" w16cid:durableId="800925187">
-    <w:abstractNumId w:val="14"/>
+    <w:abstractNumId w:val="15"/>
   </w:num>
   <w:num w:numId="2" w16cid:durableId="1047990498">
-    <w:abstractNumId w:val="9"/>
+    <w:abstractNumId w:val="10"/>
   </w:num>
   <w:num w:numId="3" w16cid:durableId="1396275024">
     <w:abstractNumId w:val="0"/>
   </w:num>
   <w:num w:numId="4" w16cid:durableId="138890979">
-    <w:abstractNumId w:val="11"/>
+    <w:abstractNumId w:val="12"/>
   </w:num>
   <w:num w:numId="5" w16cid:durableId="595135806">
-    <w:abstractNumId w:val="15"/>
+    <w:abstractNumId w:val="16"/>
   </w:num>
   <w:num w:numId="6" w16cid:durableId="731928053">
     <w:abstractNumId w:val="6"/>
@@ -1876,19 +1999,19 @@
     <w:abstractNumId w:val="5"/>
   </w:num>
   <w:num w:numId="8" w16cid:durableId="1287271727">
-    <w:abstractNumId w:val="8"/>
+    <w:abstractNumId w:val="9"/>
   </w:num>
   <w:num w:numId="9" w16cid:durableId="1309507343">
     <w:abstractNumId w:val="7"/>
   </w:num>
   <w:num w:numId="10" w16cid:durableId="1152327888">
-    <w:abstractNumId w:val="12"/>
+    <w:abstractNumId w:val="13"/>
   </w:num>
   <w:num w:numId="11" w16cid:durableId="800075389">
-    <w:abstractNumId w:val="13"/>
+    <w:abstractNumId w:val="14"/>
   </w:num>
   <w:num w:numId="12" w16cid:durableId="603154256">
-    <w:abstractNumId w:val="10"/>
+    <w:abstractNumId w:val="11"/>
   </w:num>
   <w:num w:numId="13" w16cid:durableId="448620866">
     <w:abstractNumId w:val="1"/>
@@ -1901,6 +2024,9 @@
   </w:num>
   <w:num w:numId="16" w16cid:durableId="1919708142">
     <w:abstractNumId w:val="2"/>
+  </w:num>
+  <w:num w:numId="17" w16cid:durableId="1414007476">
+    <w:abstractNumId w:val="8"/>
   </w:num>
 </w:numbering>
 </file>
@@ -2957,8 +3083,7 @@
     <w:rsid w:val="00EE285D"/>
     <w:pPr>
       <w:numPr>
-        <w:ilvl w:val="0"/>
-        <w:numId w:val="5"/>
+        <w:numId w:val="7"/>
       </w:numPr>
     </w:pPr>
   </w:style>
@@ -2994,13 +3119,11 @@
     <w:next w:val="Standaard"/>
     <w:link w:val="Kop3BijlageChar"/>
     <w:qFormat/>
-    <w:rsid w:val="00CB3BB6"/>
+    <w:rsid w:val="00DB1051"/>
     <w:pPr>
       <w:numPr>
-        <w:ilvl w:val="0"/>
         <w:numId w:val="7"/>
       </w:numPr>
-      <w:ind w:left="357" w:hanging="357"/>
     </w:pPr>
   </w:style>
   <w:style w:type="paragraph" w:customStyle="1" w:styleId="Maatregel">
@@ -3233,6 +3356,16 @@
       <w:rFonts w:ascii="Fira Code" w:hAnsi="Fira Code"/>
       <w:sz w:val="18"/>
     </w:rPr>
+  </w:style>
+  <w:style w:type="numbering" w:customStyle="1" w:styleId="Huidigelijst7">
+    <w:name w:val="Huidige lijst7"/>
+    <w:uiPriority w:val="99"/>
+    <w:rsid w:val="00DB1051"/>
+    <w:pPr>
+      <w:numPr>
+        <w:numId w:val="17"/>
+      </w:numPr>
+    </w:pPr>
   </w:style>
 </w:styles>
 </file>

</xml_diff>